<commit_message>
Update Decision Log template + complete worked example through v4
Decision Log: "AI used" relabelled to "Tool used" with expanded
guidance ("Which AI tool? Why this one?") across all 8 entry templates.

Worked example: added v4 narrative (PM dashboard that launches real
agents). Story now covers four versions with a clear arc: appearance
→ behaviour → function → role. Micro-defence, oral reflection, and
final presentation sections updated to reference all four versions
and tool-choice reasoning.

Co-Authored-By: Claude Opus 4.6 (1M context) <noreply@anthropic.com>
</commit_message>
<xml_diff>
--- a/materials/Decision_Log_Template.docx
+++ b/materials/Decision_Log_Template.docx
@@ -348,34 +348,34 @@
                 <w:sz w:val="21"/>
                 <w:szCs w:val="21"/>
               </w:rPr>
-              <w:t>AI used</w:t>
-            </w:r>
-          </w:p>
-        </w:tc>
-        <w:tc>
-          <w:tcPr>
-            <w:tcW w:w="7200" w:type="dxa"/>
-            <w:tcBorders>
-              <w:top w:val="single" w:sz="1" w:space="0" w:color="B0B0B0"/>
-              <w:left w:val="single" w:sz="1" w:space="0" w:color="B0B0B0"/>
-              <w:bottom w:val="single" w:sz="1" w:space="0" w:color="B0B0B0"/>
-              <w:right w:val="single" w:sz="1" w:space="0" w:color="B0B0B0"/>
-            </w:tcBorders>
-          </w:tcPr>
-          <w:p>
-            <w:pPr>
-              <w:spacing w:before="40" w:after="40"/>
-              <w:ind w:left="80"/>
-            </w:pPr>
-            <w:r>
-              <w:rPr>
-                <w:i/>
-                <w:iCs/>
-                <w:color w:val="666666"/>
-                <w:sz w:val="20"/>
-                <w:szCs w:val="20"/>
-              </w:rPr>
-              <w:t>Which AI tool and where? (e.g., Copilot in Word)</w:t>
+              <w:t>Tool used</w:t>
+            </w:r>
+          </w:p>
+        </w:tc>
+        <w:tc>
+          <w:tcPr>
+            <w:tcW w:w="7200" w:type="dxa"/>
+            <w:tcBorders>
+              <w:top w:val="single" w:sz="1" w:space="0" w:color="B0B0B0"/>
+              <w:left w:val="single" w:sz="1" w:space="0" w:color="B0B0B0"/>
+              <w:bottom w:val="single" w:sz="1" w:space="0" w:color="B0B0B0"/>
+              <w:right w:val="single" w:sz="1" w:space="0" w:color="B0B0B0"/>
+            </w:tcBorders>
+          </w:tcPr>
+          <w:p>
+            <w:pPr>
+              <w:spacing w:before="40" w:after="40"/>
+              <w:ind w:left="80"/>
+            </w:pPr>
+            <w:r>
+              <w:rPr>
+                <w:i/>
+                <w:iCs/>
+                <w:color w:val="666666"/>
+                <w:sz w:val="20"/>
+                <w:szCs w:val="20"/>
+              </w:rPr>
+              <w:t>Which AI tool? Why this one? (e.g., Copilot in Word — used Copilot because the task was inside a Word document)</w:t>
             </w:r>
           </w:p>
         </w:tc>
@@ -562,71 +562,15 @@
               <w:spacing w:before="40" w:after="40"/>
               <w:ind w:left="80"/>
             </w:pPr>
-            <w:proofErr w:type="gramStart"/>
-            <w:r>
-              <w:rPr>
-                <w:i/>
-                <w:iCs/>
-                <w:color w:val="666666"/>
-                <w:sz w:val="20"/>
-                <w:szCs w:val="20"/>
-              </w:rPr>
-              <w:t>Accept  /</w:t>
-            </w:r>
-            <w:proofErr w:type="gramEnd"/>
-            <w:r>
-              <w:rPr>
-                <w:i/>
-                <w:iCs/>
-                <w:color w:val="666666"/>
-                <w:sz w:val="20"/>
-                <w:szCs w:val="20"/>
-              </w:rPr>
-              <w:t xml:space="preserve">  </w:t>
-            </w:r>
-            <w:proofErr w:type="gramStart"/>
-            <w:r>
-              <w:rPr>
-                <w:i/>
-                <w:iCs/>
-                <w:color w:val="666666"/>
-                <w:sz w:val="20"/>
-                <w:szCs w:val="20"/>
-              </w:rPr>
-              <w:t>Modify  /</w:t>
-            </w:r>
-            <w:proofErr w:type="gramEnd"/>
-            <w:r>
-              <w:rPr>
-                <w:i/>
-                <w:iCs/>
-                <w:color w:val="666666"/>
-                <w:sz w:val="20"/>
-                <w:szCs w:val="20"/>
-              </w:rPr>
-              <w:t xml:space="preserve">  Reject</w:t>
-            </w:r>
-            <w:proofErr w:type="gramStart"/>
-            <w:r>
-              <w:rPr>
-                <w:i/>
-                <w:iCs/>
-                <w:color w:val="666666"/>
-                <w:sz w:val="20"/>
-                <w:szCs w:val="20"/>
-              </w:rPr>
-              <w:t xml:space="preserve">   (</w:t>
-            </w:r>
-            <w:proofErr w:type="gramEnd"/>
-            <w:r>
-              <w:rPr>
-                <w:i/>
-                <w:iCs/>
-                <w:color w:val="666666"/>
-                <w:sz w:val="20"/>
-                <w:szCs w:val="20"/>
-              </w:rPr>
-              <w:t>bold one)</w:t>
+            <w:r>
+              <w:rPr>
+                <w:i/>
+                <w:iCs/>
+                <w:color w:val="666666"/>
+                <w:sz w:val="20"/>
+                <w:szCs w:val="20"/>
+              </w:rPr>
+              <w:t>Accept  /  Modify  /  Reject   (bold one)</w:t>
             </w:r>
           </w:p>
         </w:tc>
@@ -1087,34 +1031,34 @@
                 <w:sz w:val="21"/>
                 <w:szCs w:val="21"/>
               </w:rPr>
-              <w:t>AI used</w:t>
-            </w:r>
-          </w:p>
-        </w:tc>
-        <w:tc>
-          <w:tcPr>
-            <w:tcW w:w="7200" w:type="dxa"/>
-            <w:tcBorders>
-              <w:top w:val="single" w:sz="1" w:space="0" w:color="B0B0B0"/>
-              <w:left w:val="single" w:sz="1" w:space="0" w:color="B0B0B0"/>
-              <w:bottom w:val="single" w:sz="1" w:space="0" w:color="B0B0B0"/>
-              <w:right w:val="single" w:sz="1" w:space="0" w:color="B0B0B0"/>
-            </w:tcBorders>
-          </w:tcPr>
-          <w:p>
-            <w:pPr>
-              <w:spacing w:before="40" w:after="40"/>
-              <w:ind w:left="80"/>
-            </w:pPr>
-            <w:r>
-              <w:rPr>
-                <w:i/>
-                <w:iCs/>
-                <w:color w:val="666666"/>
-                <w:sz w:val="20"/>
-                <w:szCs w:val="20"/>
-              </w:rPr>
-              <w:t>Which AI tool and where? (e.g., Copilot in Word)</w:t>
+              <w:t>Tool used</w:t>
+            </w:r>
+          </w:p>
+        </w:tc>
+        <w:tc>
+          <w:tcPr>
+            <w:tcW w:w="7200" w:type="dxa"/>
+            <w:tcBorders>
+              <w:top w:val="single" w:sz="1" w:space="0" w:color="B0B0B0"/>
+              <w:left w:val="single" w:sz="1" w:space="0" w:color="B0B0B0"/>
+              <w:bottom w:val="single" w:sz="1" w:space="0" w:color="B0B0B0"/>
+              <w:right w:val="single" w:sz="1" w:space="0" w:color="B0B0B0"/>
+            </w:tcBorders>
+          </w:tcPr>
+          <w:p>
+            <w:pPr>
+              <w:spacing w:before="40" w:after="40"/>
+              <w:ind w:left="80"/>
+            </w:pPr>
+            <w:r>
+              <w:rPr>
+                <w:i/>
+                <w:iCs/>
+                <w:color w:val="666666"/>
+                <w:sz w:val="20"/>
+                <w:szCs w:val="20"/>
+              </w:rPr>
+              <w:t>Which AI tool? Why this one? (e.g., Copilot in Word — used Copilot because the task was inside a Word document)</w:t>
             </w:r>
           </w:p>
         </w:tc>
@@ -1301,71 +1245,15 @@
               <w:spacing w:before="40" w:after="40"/>
               <w:ind w:left="80"/>
             </w:pPr>
-            <w:proofErr w:type="gramStart"/>
-            <w:r>
-              <w:rPr>
-                <w:i/>
-                <w:iCs/>
-                <w:color w:val="666666"/>
-                <w:sz w:val="20"/>
-                <w:szCs w:val="20"/>
-              </w:rPr>
-              <w:t>Accept  /</w:t>
-            </w:r>
-            <w:proofErr w:type="gramEnd"/>
-            <w:r>
-              <w:rPr>
-                <w:i/>
-                <w:iCs/>
-                <w:color w:val="666666"/>
-                <w:sz w:val="20"/>
-                <w:szCs w:val="20"/>
-              </w:rPr>
-              <w:t xml:space="preserve">  </w:t>
-            </w:r>
-            <w:proofErr w:type="gramStart"/>
-            <w:r>
-              <w:rPr>
-                <w:i/>
-                <w:iCs/>
-                <w:color w:val="666666"/>
-                <w:sz w:val="20"/>
-                <w:szCs w:val="20"/>
-              </w:rPr>
-              <w:t>Modify  /</w:t>
-            </w:r>
-            <w:proofErr w:type="gramEnd"/>
-            <w:r>
-              <w:rPr>
-                <w:i/>
-                <w:iCs/>
-                <w:color w:val="666666"/>
-                <w:sz w:val="20"/>
-                <w:szCs w:val="20"/>
-              </w:rPr>
-              <w:t xml:space="preserve">  Reject</w:t>
-            </w:r>
-            <w:proofErr w:type="gramStart"/>
-            <w:r>
-              <w:rPr>
-                <w:i/>
-                <w:iCs/>
-                <w:color w:val="666666"/>
-                <w:sz w:val="20"/>
-                <w:szCs w:val="20"/>
-              </w:rPr>
-              <w:t xml:space="preserve">   (</w:t>
-            </w:r>
-            <w:proofErr w:type="gramEnd"/>
-            <w:r>
-              <w:rPr>
-                <w:i/>
-                <w:iCs/>
-                <w:color w:val="666666"/>
-                <w:sz w:val="20"/>
-                <w:szCs w:val="20"/>
-              </w:rPr>
-              <w:t>bold one)</w:t>
+            <w:r>
+              <w:rPr>
+                <w:i/>
+                <w:iCs/>
+                <w:color w:val="666666"/>
+                <w:sz w:val="20"/>
+                <w:szCs w:val="20"/>
+              </w:rPr>
+              <w:t>Accept  /  Modify  /  Reject   (bold one)</w:t>
             </w:r>
           </w:p>
         </w:tc>
@@ -1826,34 +1714,34 @@
                 <w:sz w:val="21"/>
                 <w:szCs w:val="21"/>
               </w:rPr>
-              <w:t>AI used</w:t>
-            </w:r>
-          </w:p>
-        </w:tc>
-        <w:tc>
-          <w:tcPr>
-            <w:tcW w:w="7200" w:type="dxa"/>
-            <w:tcBorders>
-              <w:top w:val="single" w:sz="1" w:space="0" w:color="B0B0B0"/>
-              <w:left w:val="single" w:sz="1" w:space="0" w:color="B0B0B0"/>
-              <w:bottom w:val="single" w:sz="1" w:space="0" w:color="B0B0B0"/>
-              <w:right w:val="single" w:sz="1" w:space="0" w:color="B0B0B0"/>
-            </w:tcBorders>
-          </w:tcPr>
-          <w:p>
-            <w:pPr>
-              <w:spacing w:before="40" w:after="40"/>
-              <w:ind w:left="80"/>
-            </w:pPr>
-            <w:r>
-              <w:rPr>
-                <w:i/>
-                <w:iCs/>
-                <w:color w:val="666666"/>
-                <w:sz w:val="20"/>
-                <w:szCs w:val="20"/>
-              </w:rPr>
-              <w:t>Which AI tool and where? (e.g., Copilot in Word)</w:t>
+              <w:t>Tool used</w:t>
+            </w:r>
+          </w:p>
+        </w:tc>
+        <w:tc>
+          <w:tcPr>
+            <w:tcW w:w="7200" w:type="dxa"/>
+            <w:tcBorders>
+              <w:top w:val="single" w:sz="1" w:space="0" w:color="B0B0B0"/>
+              <w:left w:val="single" w:sz="1" w:space="0" w:color="B0B0B0"/>
+              <w:bottom w:val="single" w:sz="1" w:space="0" w:color="B0B0B0"/>
+              <w:right w:val="single" w:sz="1" w:space="0" w:color="B0B0B0"/>
+            </w:tcBorders>
+          </w:tcPr>
+          <w:p>
+            <w:pPr>
+              <w:spacing w:before="40" w:after="40"/>
+              <w:ind w:left="80"/>
+            </w:pPr>
+            <w:r>
+              <w:rPr>
+                <w:i/>
+                <w:iCs/>
+                <w:color w:val="666666"/>
+                <w:sz w:val="20"/>
+                <w:szCs w:val="20"/>
+              </w:rPr>
+              <w:t>Which AI tool? Why this one? (e.g., Copilot in Word — used Copilot because the task was inside a Word document)</w:t>
             </w:r>
           </w:p>
         </w:tc>
@@ -2040,71 +1928,15 @@
               <w:spacing w:before="40" w:after="40"/>
               <w:ind w:left="80"/>
             </w:pPr>
-            <w:proofErr w:type="gramStart"/>
-            <w:r>
-              <w:rPr>
-                <w:i/>
-                <w:iCs/>
-                <w:color w:val="666666"/>
-                <w:sz w:val="20"/>
-                <w:szCs w:val="20"/>
-              </w:rPr>
-              <w:t>Accept  /</w:t>
-            </w:r>
-            <w:proofErr w:type="gramEnd"/>
-            <w:r>
-              <w:rPr>
-                <w:i/>
-                <w:iCs/>
-                <w:color w:val="666666"/>
-                <w:sz w:val="20"/>
-                <w:szCs w:val="20"/>
-              </w:rPr>
-              <w:t xml:space="preserve">  </w:t>
-            </w:r>
-            <w:proofErr w:type="gramStart"/>
-            <w:r>
-              <w:rPr>
-                <w:i/>
-                <w:iCs/>
-                <w:color w:val="666666"/>
-                <w:sz w:val="20"/>
-                <w:szCs w:val="20"/>
-              </w:rPr>
-              <w:t>Modify  /</w:t>
-            </w:r>
-            <w:proofErr w:type="gramEnd"/>
-            <w:r>
-              <w:rPr>
-                <w:i/>
-                <w:iCs/>
-                <w:color w:val="666666"/>
-                <w:sz w:val="20"/>
-                <w:szCs w:val="20"/>
-              </w:rPr>
-              <w:t xml:space="preserve">  Reject</w:t>
-            </w:r>
-            <w:proofErr w:type="gramStart"/>
-            <w:r>
-              <w:rPr>
-                <w:i/>
-                <w:iCs/>
-                <w:color w:val="666666"/>
-                <w:sz w:val="20"/>
-                <w:szCs w:val="20"/>
-              </w:rPr>
-              <w:t xml:space="preserve">   (</w:t>
-            </w:r>
-            <w:proofErr w:type="gramEnd"/>
-            <w:r>
-              <w:rPr>
-                <w:i/>
-                <w:iCs/>
-                <w:color w:val="666666"/>
-                <w:sz w:val="20"/>
-                <w:szCs w:val="20"/>
-              </w:rPr>
-              <w:t>bold one)</w:t>
+            <w:r>
+              <w:rPr>
+                <w:i/>
+                <w:iCs/>
+                <w:color w:val="666666"/>
+                <w:sz w:val="20"/>
+                <w:szCs w:val="20"/>
+              </w:rPr>
+              <w:t>Accept  /  Modify  /  Reject   (bold one)</w:t>
             </w:r>
           </w:p>
         </w:tc>
@@ -2565,34 +2397,34 @@
                 <w:sz w:val="21"/>
                 <w:szCs w:val="21"/>
               </w:rPr>
-              <w:t>AI used</w:t>
-            </w:r>
-          </w:p>
-        </w:tc>
-        <w:tc>
-          <w:tcPr>
-            <w:tcW w:w="7200" w:type="dxa"/>
-            <w:tcBorders>
-              <w:top w:val="single" w:sz="1" w:space="0" w:color="B0B0B0"/>
-              <w:left w:val="single" w:sz="1" w:space="0" w:color="B0B0B0"/>
-              <w:bottom w:val="single" w:sz="1" w:space="0" w:color="B0B0B0"/>
-              <w:right w:val="single" w:sz="1" w:space="0" w:color="B0B0B0"/>
-            </w:tcBorders>
-          </w:tcPr>
-          <w:p>
-            <w:pPr>
-              <w:spacing w:before="40" w:after="40"/>
-              <w:ind w:left="80"/>
-            </w:pPr>
-            <w:r>
-              <w:rPr>
-                <w:i/>
-                <w:iCs/>
-                <w:color w:val="666666"/>
-                <w:sz w:val="20"/>
-                <w:szCs w:val="20"/>
-              </w:rPr>
-              <w:t>Which AI tool and where? (e.g., Copilot in Word)</w:t>
+              <w:t>Tool used</w:t>
+            </w:r>
+          </w:p>
+        </w:tc>
+        <w:tc>
+          <w:tcPr>
+            <w:tcW w:w="7200" w:type="dxa"/>
+            <w:tcBorders>
+              <w:top w:val="single" w:sz="1" w:space="0" w:color="B0B0B0"/>
+              <w:left w:val="single" w:sz="1" w:space="0" w:color="B0B0B0"/>
+              <w:bottom w:val="single" w:sz="1" w:space="0" w:color="B0B0B0"/>
+              <w:right w:val="single" w:sz="1" w:space="0" w:color="B0B0B0"/>
+            </w:tcBorders>
+          </w:tcPr>
+          <w:p>
+            <w:pPr>
+              <w:spacing w:before="40" w:after="40"/>
+              <w:ind w:left="80"/>
+            </w:pPr>
+            <w:r>
+              <w:rPr>
+                <w:i/>
+                <w:iCs/>
+                <w:color w:val="666666"/>
+                <w:sz w:val="20"/>
+                <w:szCs w:val="20"/>
+              </w:rPr>
+              <w:t>Which AI tool? Why this one? (e.g., Copilot in Word — used Copilot because the task was inside a Word document)</w:t>
             </w:r>
           </w:p>
         </w:tc>
@@ -2779,71 +2611,15 @@
               <w:spacing w:before="40" w:after="40"/>
               <w:ind w:left="80"/>
             </w:pPr>
-            <w:proofErr w:type="gramStart"/>
-            <w:r>
-              <w:rPr>
-                <w:i/>
-                <w:iCs/>
-                <w:color w:val="666666"/>
-                <w:sz w:val="20"/>
-                <w:szCs w:val="20"/>
-              </w:rPr>
-              <w:t>Accept  /</w:t>
-            </w:r>
-            <w:proofErr w:type="gramEnd"/>
-            <w:r>
-              <w:rPr>
-                <w:i/>
-                <w:iCs/>
-                <w:color w:val="666666"/>
-                <w:sz w:val="20"/>
-                <w:szCs w:val="20"/>
-              </w:rPr>
-              <w:t xml:space="preserve">  </w:t>
-            </w:r>
-            <w:proofErr w:type="gramStart"/>
-            <w:r>
-              <w:rPr>
-                <w:i/>
-                <w:iCs/>
-                <w:color w:val="666666"/>
-                <w:sz w:val="20"/>
-                <w:szCs w:val="20"/>
-              </w:rPr>
-              <w:t>Modify  /</w:t>
-            </w:r>
-            <w:proofErr w:type="gramEnd"/>
-            <w:r>
-              <w:rPr>
-                <w:i/>
-                <w:iCs/>
-                <w:color w:val="666666"/>
-                <w:sz w:val="20"/>
-                <w:szCs w:val="20"/>
-              </w:rPr>
-              <w:t xml:space="preserve">  Reject</w:t>
-            </w:r>
-            <w:proofErr w:type="gramStart"/>
-            <w:r>
-              <w:rPr>
-                <w:i/>
-                <w:iCs/>
-                <w:color w:val="666666"/>
-                <w:sz w:val="20"/>
-                <w:szCs w:val="20"/>
-              </w:rPr>
-              <w:t xml:space="preserve">   (</w:t>
-            </w:r>
-            <w:proofErr w:type="gramEnd"/>
-            <w:r>
-              <w:rPr>
-                <w:i/>
-                <w:iCs/>
-                <w:color w:val="666666"/>
-                <w:sz w:val="20"/>
-                <w:szCs w:val="20"/>
-              </w:rPr>
-              <w:t>bold one)</w:t>
+            <w:r>
+              <w:rPr>
+                <w:i/>
+                <w:iCs/>
+                <w:color w:val="666666"/>
+                <w:sz w:val="20"/>
+                <w:szCs w:val="20"/>
+              </w:rPr>
+              <w:t>Accept  /  Modify  /  Reject   (bold one)</w:t>
             </w:r>
           </w:p>
         </w:tc>
@@ -3304,34 +3080,34 @@
                 <w:sz w:val="21"/>
                 <w:szCs w:val="21"/>
               </w:rPr>
-              <w:t>AI used</w:t>
-            </w:r>
-          </w:p>
-        </w:tc>
-        <w:tc>
-          <w:tcPr>
-            <w:tcW w:w="7200" w:type="dxa"/>
-            <w:tcBorders>
-              <w:top w:val="single" w:sz="1" w:space="0" w:color="B0B0B0"/>
-              <w:left w:val="single" w:sz="1" w:space="0" w:color="B0B0B0"/>
-              <w:bottom w:val="single" w:sz="1" w:space="0" w:color="B0B0B0"/>
-              <w:right w:val="single" w:sz="1" w:space="0" w:color="B0B0B0"/>
-            </w:tcBorders>
-          </w:tcPr>
-          <w:p>
-            <w:pPr>
-              <w:spacing w:before="40" w:after="40"/>
-              <w:ind w:left="80"/>
-            </w:pPr>
-            <w:r>
-              <w:rPr>
-                <w:i/>
-                <w:iCs/>
-                <w:color w:val="666666"/>
-                <w:sz w:val="20"/>
-                <w:szCs w:val="20"/>
-              </w:rPr>
-              <w:t>Which AI tool and where? (e.g., Copilot in Word)</w:t>
+              <w:t>Tool used</w:t>
+            </w:r>
+          </w:p>
+        </w:tc>
+        <w:tc>
+          <w:tcPr>
+            <w:tcW w:w="7200" w:type="dxa"/>
+            <w:tcBorders>
+              <w:top w:val="single" w:sz="1" w:space="0" w:color="B0B0B0"/>
+              <w:left w:val="single" w:sz="1" w:space="0" w:color="B0B0B0"/>
+              <w:bottom w:val="single" w:sz="1" w:space="0" w:color="B0B0B0"/>
+              <w:right w:val="single" w:sz="1" w:space="0" w:color="B0B0B0"/>
+            </w:tcBorders>
+          </w:tcPr>
+          <w:p>
+            <w:pPr>
+              <w:spacing w:before="40" w:after="40"/>
+              <w:ind w:left="80"/>
+            </w:pPr>
+            <w:r>
+              <w:rPr>
+                <w:i/>
+                <w:iCs/>
+                <w:color w:val="666666"/>
+                <w:sz w:val="20"/>
+                <w:szCs w:val="20"/>
+              </w:rPr>
+              <w:t>Which AI tool? Why this one? (e.g., Copilot in Word — used Copilot because the task was inside a Word document)</w:t>
             </w:r>
           </w:p>
         </w:tc>
@@ -3518,71 +3294,15 @@
               <w:spacing w:before="40" w:after="40"/>
               <w:ind w:left="80"/>
             </w:pPr>
-            <w:proofErr w:type="gramStart"/>
-            <w:r>
-              <w:rPr>
-                <w:i/>
-                <w:iCs/>
-                <w:color w:val="666666"/>
-                <w:sz w:val="20"/>
-                <w:szCs w:val="20"/>
-              </w:rPr>
-              <w:t>Accept  /</w:t>
-            </w:r>
-            <w:proofErr w:type="gramEnd"/>
-            <w:r>
-              <w:rPr>
-                <w:i/>
-                <w:iCs/>
-                <w:color w:val="666666"/>
-                <w:sz w:val="20"/>
-                <w:szCs w:val="20"/>
-              </w:rPr>
-              <w:t xml:space="preserve">  </w:t>
-            </w:r>
-            <w:proofErr w:type="gramStart"/>
-            <w:r>
-              <w:rPr>
-                <w:i/>
-                <w:iCs/>
-                <w:color w:val="666666"/>
-                <w:sz w:val="20"/>
-                <w:szCs w:val="20"/>
-              </w:rPr>
-              <w:t>Modify  /</w:t>
-            </w:r>
-            <w:proofErr w:type="gramEnd"/>
-            <w:r>
-              <w:rPr>
-                <w:i/>
-                <w:iCs/>
-                <w:color w:val="666666"/>
-                <w:sz w:val="20"/>
-                <w:szCs w:val="20"/>
-              </w:rPr>
-              <w:t xml:space="preserve">  Reject</w:t>
-            </w:r>
-            <w:proofErr w:type="gramStart"/>
-            <w:r>
-              <w:rPr>
-                <w:i/>
-                <w:iCs/>
-                <w:color w:val="666666"/>
-                <w:sz w:val="20"/>
-                <w:szCs w:val="20"/>
-              </w:rPr>
-              <w:t xml:space="preserve">   (</w:t>
-            </w:r>
-            <w:proofErr w:type="gramEnd"/>
-            <w:r>
-              <w:rPr>
-                <w:i/>
-                <w:iCs/>
-                <w:color w:val="666666"/>
-                <w:sz w:val="20"/>
-                <w:szCs w:val="20"/>
-              </w:rPr>
-              <w:t>bold one)</w:t>
+            <w:r>
+              <w:rPr>
+                <w:i/>
+                <w:iCs/>
+                <w:color w:val="666666"/>
+                <w:sz w:val="20"/>
+                <w:szCs w:val="20"/>
+              </w:rPr>
+              <w:t>Accept  /  Modify  /  Reject   (bold one)</w:t>
             </w:r>
           </w:p>
         </w:tc>
@@ -4043,34 +3763,34 @@
                 <w:sz w:val="21"/>
                 <w:szCs w:val="21"/>
               </w:rPr>
-              <w:t>AI used</w:t>
-            </w:r>
-          </w:p>
-        </w:tc>
-        <w:tc>
-          <w:tcPr>
-            <w:tcW w:w="7200" w:type="dxa"/>
-            <w:tcBorders>
-              <w:top w:val="single" w:sz="1" w:space="0" w:color="B0B0B0"/>
-              <w:left w:val="single" w:sz="1" w:space="0" w:color="B0B0B0"/>
-              <w:bottom w:val="single" w:sz="1" w:space="0" w:color="B0B0B0"/>
-              <w:right w:val="single" w:sz="1" w:space="0" w:color="B0B0B0"/>
-            </w:tcBorders>
-          </w:tcPr>
-          <w:p>
-            <w:pPr>
-              <w:spacing w:before="40" w:after="40"/>
-              <w:ind w:left="80"/>
-            </w:pPr>
-            <w:r>
-              <w:rPr>
-                <w:i/>
-                <w:iCs/>
-                <w:color w:val="666666"/>
-                <w:sz w:val="20"/>
-                <w:szCs w:val="20"/>
-              </w:rPr>
-              <w:t>Which AI tool and where? (e.g., Copilot in Word)</w:t>
+              <w:t>Tool used</w:t>
+            </w:r>
+          </w:p>
+        </w:tc>
+        <w:tc>
+          <w:tcPr>
+            <w:tcW w:w="7200" w:type="dxa"/>
+            <w:tcBorders>
+              <w:top w:val="single" w:sz="1" w:space="0" w:color="B0B0B0"/>
+              <w:left w:val="single" w:sz="1" w:space="0" w:color="B0B0B0"/>
+              <w:bottom w:val="single" w:sz="1" w:space="0" w:color="B0B0B0"/>
+              <w:right w:val="single" w:sz="1" w:space="0" w:color="B0B0B0"/>
+            </w:tcBorders>
+          </w:tcPr>
+          <w:p>
+            <w:pPr>
+              <w:spacing w:before="40" w:after="40"/>
+              <w:ind w:left="80"/>
+            </w:pPr>
+            <w:r>
+              <w:rPr>
+                <w:i/>
+                <w:iCs/>
+                <w:color w:val="666666"/>
+                <w:sz w:val="20"/>
+                <w:szCs w:val="20"/>
+              </w:rPr>
+              <w:t>Which AI tool? Why this one? (e.g., Copilot in Word — used Copilot because the task was inside a Word document)</w:t>
             </w:r>
           </w:p>
         </w:tc>
@@ -4257,71 +3977,15 @@
               <w:spacing w:before="40" w:after="40"/>
               <w:ind w:left="80"/>
             </w:pPr>
-            <w:proofErr w:type="gramStart"/>
-            <w:r>
-              <w:rPr>
-                <w:i/>
-                <w:iCs/>
-                <w:color w:val="666666"/>
-                <w:sz w:val="20"/>
-                <w:szCs w:val="20"/>
-              </w:rPr>
-              <w:t>Accept  /</w:t>
-            </w:r>
-            <w:proofErr w:type="gramEnd"/>
-            <w:r>
-              <w:rPr>
-                <w:i/>
-                <w:iCs/>
-                <w:color w:val="666666"/>
-                <w:sz w:val="20"/>
-                <w:szCs w:val="20"/>
-              </w:rPr>
-              <w:t xml:space="preserve">  </w:t>
-            </w:r>
-            <w:proofErr w:type="gramStart"/>
-            <w:r>
-              <w:rPr>
-                <w:i/>
-                <w:iCs/>
-                <w:color w:val="666666"/>
-                <w:sz w:val="20"/>
-                <w:szCs w:val="20"/>
-              </w:rPr>
-              <w:t>Modify  /</w:t>
-            </w:r>
-            <w:proofErr w:type="gramEnd"/>
-            <w:r>
-              <w:rPr>
-                <w:i/>
-                <w:iCs/>
-                <w:color w:val="666666"/>
-                <w:sz w:val="20"/>
-                <w:szCs w:val="20"/>
-              </w:rPr>
-              <w:t xml:space="preserve">  Reject</w:t>
-            </w:r>
-            <w:proofErr w:type="gramStart"/>
-            <w:r>
-              <w:rPr>
-                <w:i/>
-                <w:iCs/>
-                <w:color w:val="666666"/>
-                <w:sz w:val="20"/>
-                <w:szCs w:val="20"/>
-              </w:rPr>
-              <w:t xml:space="preserve">   (</w:t>
-            </w:r>
-            <w:proofErr w:type="gramEnd"/>
-            <w:r>
-              <w:rPr>
-                <w:i/>
-                <w:iCs/>
-                <w:color w:val="666666"/>
-                <w:sz w:val="20"/>
-                <w:szCs w:val="20"/>
-              </w:rPr>
-              <w:t>bold one)</w:t>
+            <w:r>
+              <w:rPr>
+                <w:i/>
+                <w:iCs/>
+                <w:color w:val="666666"/>
+                <w:sz w:val="20"/>
+                <w:szCs w:val="20"/>
+              </w:rPr>
+              <w:t>Accept  /  Modify  /  Reject   (bold one)</w:t>
             </w:r>
           </w:p>
         </w:tc>
@@ -4782,34 +4446,34 @@
                 <w:sz w:val="21"/>
                 <w:szCs w:val="21"/>
               </w:rPr>
-              <w:t>AI used</w:t>
-            </w:r>
-          </w:p>
-        </w:tc>
-        <w:tc>
-          <w:tcPr>
-            <w:tcW w:w="7200" w:type="dxa"/>
-            <w:tcBorders>
-              <w:top w:val="single" w:sz="1" w:space="0" w:color="B0B0B0"/>
-              <w:left w:val="single" w:sz="1" w:space="0" w:color="B0B0B0"/>
-              <w:bottom w:val="single" w:sz="1" w:space="0" w:color="B0B0B0"/>
-              <w:right w:val="single" w:sz="1" w:space="0" w:color="B0B0B0"/>
-            </w:tcBorders>
-          </w:tcPr>
-          <w:p>
-            <w:pPr>
-              <w:spacing w:before="40" w:after="40"/>
-              <w:ind w:left="80"/>
-            </w:pPr>
-            <w:r>
-              <w:rPr>
-                <w:i/>
-                <w:iCs/>
-                <w:color w:val="666666"/>
-                <w:sz w:val="20"/>
-                <w:szCs w:val="20"/>
-              </w:rPr>
-              <w:t>Which AI tool and where? (e.g., Copilot in Word)</w:t>
+              <w:t>Tool used</w:t>
+            </w:r>
+          </w:p>
+        </w:tc>
+        <w:tc>
+          <w:tcPr>
+            <w:tcW w:w="7200" w:type="dxa"/>
+            <w:tcBorders>
+              <w:top w:val="single" w:sz="1" w:space="0" w:color="B0B0B0"/>
+              <w:left w:val="single" w:sz="1" w:space="0" w:color="B0B0B0"/>
+              <w:bottom w:val="single" w:sz="1" w:space="0" w:color="B0B0B0"/>
+              <w:right w:val="single" w:sz="1" w:space="0" w:color="B0B0B0"/>
+            </w:tcBorders>
+          </w:tcPr>
+          <w:p>
+            <w:pPr>
+              <w:spacing w:before="40" w:after="40"/>
+              <w:ind w:left="80"/>
+            </w:pPr>
+            <w:r>
+              <w:rPr>
+                <w:i/>
+                <w:iCs/>
+                <w:color w:val="666666"/>
+                <w:sz w:val="20"/>
+                <w:szCs w:val="20"/>
+              </w:rPr>
+              <w:t>Which AI tool? Why this one? (e.g., Copilot in Word — used Copilot because the task was inside a Word document)</w:t>
             </w:r>
           </w:p>
         </w:tc>
@@ -4996,71 +4660,15 @@
               <w:spacing w:before="40" w:after="40"/>
               <w:ind w:left="80"/>
             </w:pPr>
-            <w:proofErr w:type="gramStart"/>
-            <w:r>
-              <w:rPr>
-                <w:i/>
-                <w:iCs/>
-                <w:color w:val="666666"/>
-                <w:sz w:val="20"/>
-                <w:szCs w:val="20"/>
-              </w:rPr>
-              <w:t>Accept  /</w:t>
-            </w:r>
-            <w:proofErr w:type="gramEnd"/>
-            <w:r>
-              <w:rPr>
-                <w:i/>
-                <w:iCs/>
-                <w:color w:val="666666"/>
-                <w:sz w:val="20"/>
-                <w:szCs w:val="20"/>
-              </w:rPr>
-              <w:t xml:space="preserve">  </w:t>
-            </w:r>
-            <w:proofErr w:type="gramStart"/>
-            <w:r>
-              <w:rPr>
-                <w:i/>
-                <w:iCs/>
-                <w:color w:val="666666"/>
-                <w:sz w:val="20"/>
-                <w:szCs w:val="20"/>
-              </w:rPr>
-              <w:t>Modify  /</w:t>
-            </w:r>
-            <w:proofErr w:type="gramEnd"/>
-            <w:r>
-              <w:rPr>
-                <w:i/>
-                <w:iCs/>
-                <w:color w:val="666666"/>
-                <w:sz w:val="20"/>
-                <w:szCs w:val="20"/>
-              </w:rPr>
-              <w:t xml:space="preserve">  Reject</w:t>
-            </w:r>
-            <w:proofErr w:type="gramStart"/>
-            <w:r>
-              <w:rPr>
-                <w:i/>
-                <w:iCs/>
-                <w:color w:val="666666"/>
-                <w:sz w:val="20"/>
-                <w:szCs w:val="20"/>
-              </w:rPr>
-              <w:t xml:space="preserve">   (</w:t>
-            </w:r>
-            <w:proofErr w:type="gramEnd"/>
-            <w:r>
-              <w:rPr>
-                <w:i/>
-                <w:iCs/>
-                <w:color w:val="666666"/>
-                <w:sz w:val="20"/>
-                <w:szCs w:val="20"/>
-              </w:rPr>
-              <w:t>bold one)</w:t>
+            <w:r>
+              <w:rPr>
+                <w:i/>
+                <w:iCs/>
+                <w:color w:val="666666"/>
+                <w:sz w:val="20"/>
+                <w:szCs w:val="20"/>
+              </w:rPr>
+              <w:t>Accept  /  Modify  /  Reject   (bold one)</w:t>
             </w:r>
           </w:p>
         </w:tc>
@@ -5521,34 +5129,34 @@
                 <w:sz w:val="21"/>
                 <w:szCs w:val="21"/>
               </w:rPr>
-              <w:t>AI used</w:t>
-            </w:r>
-          </w:p>
-        </w:tc>
-        <w:tc>
-          <w:tcPr>
-            <w:tcW w:w="7200" w:type="dxa"/>
-            <w:tcBorders>
-              <w:top w:val="single" w:sz="1" w:space="0" w:color="B0B0B0"/>
-              <w:left w:val="single" w:sz="1" w:space="0" w:color="B0B0B0"/>
-              <w:bottom w:val="single" w:sz="1" w:space="0" w:color="B0B0B0"/>
-              <w:right w:val="single" w:sz="1" w:space="0" w:color="B0B0B0"/>
-            </w:tcBorders>
-          </w:tcPr>
-          <w:p>
-            <w:pPr>
-              <w:spacing w:before="40" w:after="40"/>
-              <w:ind w:left="80"/>
-            </w:pPr>
-            <w:r>
-              <w:rPr>
-                <w:i/>
-                <w:iCs/>
-                <w:color w:val="666666"/>
-                <w:sz w:val="20"/>
-                <w:szCs w:val="20"/>
-              </w:rPr>
-              <w:t>Which AI tool and where? (e.g., Copilot in Word)</w:t>
+              <w:t>Tool used</w:t>
+            </w:r>
+          </w:p>
+        </w:tc>
+        <w:tc>
+          <w:tcPr>
+            <w:tcW w:w="7200" w:type="dxa"/>
+            <w:tcBorders>
+              <w:top w:val="single" w:sz="1" w:space="0" w:color="B0B0B0"/>
+              <w:left w:val="single" w:sz="1" w:space="0" w:color="B0B0B0"/>
+              <w:bottom w:val="single" w:sz="1" w:space="0" w:color="B0B0B0"/>
+              <w:right w:val="single" w:sz="1" w:space="0" w:color="B0B0B0"/>
+            </w:tcBorders>
+          </w:tcPr>
+          <w:p>
+            <w:pPr>
+              <w:spacing w:before="40" w:after="40"/>
+              <w:ind w:left="80"/>
+            </w:pPr>
+            <w:r>
+              <w:rPr>
+                <w:i/>
+                <w:iCs/>
+                <w:color w:val="666666"/>
+                <w:sz w:val="20"/>
+                <w:szCs w:val="20"/>
+              </w:rPr>
+              <w:t>Which AI tool? Why this one? (e.g., Copilot in Word — used Copilot because the task was inside a Word document)</w:t>
             </w:r>
           </w:p>
         </w:tc>
@@ -5735,71 +5343,15 @@
               <w:spacing w:before="40" w:after="40"/>
               <w:ind w:left="80"/>
             </w:pPr>
-            <w:proofErr w:type="gramStart"/>
-            <w:r>
-              <w:rPr>
-                <w:i/>
-                <w:iCs/>
-                <w:color w:val="666666"/>
-                <w:sz w:val="20"/>
-                <w:szCs w:val="20"/>
-              </w:rPr>
-              <w:t>Accept  /</w:t>
-            </w:r>
-            <w:proofErr w:type="gramEnd"/>
-            <w:r>
-              <w:rPr>
-                <w:i/>
-                <w:iCs/>
-                <w:color w:val="666666"/>
-                <w:sz w:val="20"/>
-                <w:szCs w:val="20"/>
-              </w:rPr>
-              <w:t xml:space="preserve">  </w:t>
-            </w:r>
-            <w:proofErr w:type="gramStart"/>
-            <w:r>
-              <w:rPr>
-                <w:i/>
-                <w:iCs/>
-                <w:color w:val="666666"/>
-                <w:sz w:val="20"/>
-                <w:szCs w:val="20"/>
-              </w:rPr>
-              <w:t>Modify  /</w:t>
-            </w:r>
-            <w:proofErr w:type="gramEnd"/>
-            <w:r>
-              <w:rPr>
-                <w:i/>
-                <w:iCs/>
-                <w:color w:val="666666"/>
-                <w:sz w:val="20"/>
-                <w:szCs w:val="20"/>
-              </w:rPr>
-              <w:t xml:space="preserve">  Reject</w:t>
-            </w:r>
-            <w:proofErr w:type="gramStart"/>
-            <w:r>
-              <w:rPr>
-                <w:i/>
-                <w:iCs/>
-                <w:color w:val="666666"/>
-                <w:sz w:val="20"/>
-                <w:szCs w:val="20"/>
-              </w:rPr>
-              <w:t xml:space="preserve">   (</w:t>
-            </w:r>
-            <w:proofErr w:type="gramEnd"/>
-            <w:r>
-              <w:rPr>
-                <w:i/>
-                <w:iCs/>
-                <w:color w:val="666666"/>
-                <w:sz w:val="20"/>
-                <w:szCs w:val="20"/>
-              </w:rPr>
-              <w:t>bold one)</w:t>
+            <w:r>
+              <w:rPr>
+                <w:i/>
+                <w:iCs/>
+                <w:color w:val="666666"/>
+                <w:sz w:val="20"/>
+                <w:szCs w:val="20"/>
+              </w:rPr>
+              <w:t>Accept  /  Modify  /  Reject   (bold one)</w:t>
             </w:r>
           </w:p>
         </w:tc>

</xml_diff>